<commit_message>
Add the division of work section and update the sprint timeline
</commit_message>
<xml_diff>
--- a/report/Project_II_Report_Plagiarism_Detector.docx
+++ b/report/Project_II_Report_Plagiarism_Detector.docx
@@ -4,7 +4,7 @@
   <w:body>
     <w:p>
       <w:pPr>
-        <w:spacing w:before="720" w:after="480" w:line="360" w:lineRule="auto"/>
+        <w:spacing w:before="480" w:after="480" w:line="360" w:lineRule="auto"/>
         <w:jc w:val="center"/>
       </w:pPr>
       <w:r>
@@ -49,7 +49,7 @@
     </w:p>
     <w:p>
       <w:pPr>
-        <w:spacing w:before="0" w:after="600" w:line="360" w:lineRule="auto"/>
+        <w:spacing w:before="0" w:after="2300" w:line="360" w:lineRule="auto"/>
         <w:jc w:val="center"/>
       </w:pPr>
       <w:r>
@@ -124,7 +124,7 @@
     </w:p>
     <w:p>
       <w:pPr>
-        <w:spacing w:before="0" w:after="600" w:line="360" w:lineRule="auto"/>
+        <w:spacing w:before="0" w:after="3000" w:line="360" w:lineRule="auto"/>
       </w:pPr>
     </w:p>
     <w:p>
@@ -194,7 +194,7 @@
     </w:p>
     <w:p>
       <w:pPr>
-        <w:spacing w:before="720" w:after="480" w:line="360" w:lineRule="auto"/>
+        <w:spacing w:before="480" w:after="480" w:line="360" w:lineRule="auto"/>
         <w:jc w:val="center"/>
       </w:pPr>
       <w:r>
@@ -239,7 +239,7 @@
     </w:p>
     <w:p>
       <w:pPr>
-        <w:spacing w:before="0" w:after="600" w:line="360" w:lineRule="auto"/>
+        <w:spacing w:before="0" w:after="1900" w:line="360" w:lineRule="auto"/>
         <w:jc w:val="center"/>
       </w:pPr>
       <w:r>
@@ -314,7 +314,7 @@
     </w:p>
     <w:p>
       <w:pPr>
-        <w:spacing w:before="0" w:after="360" w:line="360" w:lineRule="auto"/>
+        <w:spacing w:before="0" w:after="2400" w:line="360" w:lineRule="auto"/>
       </w:pPr>
     </w:p>
     <w:p>
@@ -1052,7 +1052,7 @@
           <w:i w:val="0"/>
           <w:sz w:val="24"/>
         </w:rPr>
-        <w:t>We would like to extend our sincerest gratitude to our project supervisor Er. Prativa Nyaupane for the valued suggestions and guidance given to us throughout the development of this project. The weekly review meetings kept the work honest and measurable, and many of the decisions recorded in this report, such as keeping a classical baseline for comparison and fixing the similarity threshold from experiment rather than by guess, came directly from those meetings.</w:t>
+        <w:t>We would like to extend our sincerest gratitude to our project supervisor Er. Prativa Nyaupane for the valued suggestions and guidance given to us throughout the development of this project. The regular review meetings kept the work honest and measurable, and many of the decisions recorded in this report, such as keeping a classical baseline for comparison and fixing the similarity threshold from experiment rather than by guess, came directly from those meetings.</w:t>
       </w:r>
     </w:p>
     <w:p>
@@ -1879,6 +1879,25 @@
           <w:tab w:pos="8424" w:val="right" w:leader="dot"/>
         </w:tabs>
         <w:spacing w:line="276" w:lineRule="auto" w:after="120"/>
+        <w:ind w:left="864"/>
+      </w:pPr>
+      <w:r>
+        <w:rPr>
+          <w:rFonts w:ascii="Times New Roman" w:hAnsi="Times New Roman"/>
+          <w:b w:val="0"/>
+          <w:sz w:val="24"/>
+        </w:rPr>
+        <w:t>3.2.10  Division of Work</w:t>
+        <w:tab/>
+        <w:t>17</w:t>
+      </w:r>
+    </w:p>
+    <w:p>
+      <w:pPr>
+        <w:tabs>
+          <w:tab w:pos="8424" w:val="right" w:leader="dot"/>
+        </w:tabs>
+        <w:spacing w:line="276" w:lineRule="auto" w:after="120"/>
         <w:ind w:left="0"/>
       </w:pPr>
       <w:r>
@@ -1888,14 +1907,14 @@
           <w:sz w:val="24"/>
         </w:rPr>
         <w:t>Chapter 4 TESTING</w:t>
-      </w:r>
-      <w:r>
-        <w:rPr>
-          <w:rFonts w:ascii="Times New Roman" w:hAnsi="Times New Roman"/>
-          <w:sz w:val="24"/>
-        </w:rPr>
         <w:tab/>
-        <w:t>18</w:t>
+        <w:t>19</w:t>
+      </w:r>
+      <w:r>
+        <w:rPr>
+          <w:rFonts w:ascii="Times New Roman" w:hAnsi="Times New Roman"/>
+          <w:sz w:val="24"/>
+        </w:rPr>
       </w:r>
     </w:p>
     <w:p>
@@ -1913,14 +1932,14 @@
           <w:sz w:val="24"/>
         </w:rPr>
         <w:t>4.1  Test Objectives</w:t>
-      </w:r>
-      <w:r>
-        <w:rPr>
-          <w:rFonts w:ascii="Times New Roman" w:hAnsi="Times New Roman"/>
-          <w:sz w:val="24"/>
-        </w:rPr>
         <w:tab/>
-        <w:t>18</w:t>
+        <w:t>19</w:t>
+      </w:r>
+      <w:r>
+        <w:rPr>
+          <w:rFonts w:ascii="Times New Roman" w:hAnsi="Times New Roman"/>
+          <w:sz w:val="24"/>
+        </w:rPr>
       </w:r>
     </w:p>
     <w:p>
@@ -1938,14 +1957,14 @@
           <w:sz w:val="24"/>
         </w:rPr>
         <w:t>4.2  Unit Testing</w:t>
-      </w:r>
-      <w:r>
-        <w:rPr>
-          <w:rFonts w:ascii="Times New Roman" w:hAnsi="Times New Roman"/>
-          <w:sz w:val="24"/>
-        </w:rPr>
         <w:tab/>
-        <w:t>18</w:t>
+        <w:t>19</w:t>
+      </w:r>
+      <w:r>
+        <w:rPr>
+          <w:rFonts w:ascii="Times New Roman" w:hAnsi="Times New Roman"/>
+          <w:sz w:val="24"/>
+        </w:rPr>
       </w:r>
     </w:p>
     <w:p>
@@ -1963,14 +1982,14 @@
           <w:sz w:val="24"/>
         </w:rPr>
         <w:t>4.3  Functional Test Cases</w:t>
-      </w:r>
-      <w:r>
-        <w:rPr>
-          <w:rFonts w:ascii="Times New Roman" w:hAnsi="Times New Roman"/>
-          <w:sz w:val="24"/>
-        </w:rPr>
         <w:tab/>
-        <w:t>19</w:t>
+        <w:t>20</w:t>
+      </w:r>
+      <w:r>
+        <w:rPr>
+          <w:rFonts w:ascii="Times New Roman" w:hAnsi="Times New Roman"/>
+          <w:sz w:val="24"/>
+        </w:rPr>
       </w:r>
     </w:p>
     <w:p>
@@ -1988,14 +2007,14 @@
           <w:sz w:val="24"/>
         </w:rPr>
         <w:t>4.4  Acceptance Testing</w:t>
-      </w:r>
-      <w:r>
-        <w:rPr>
-          <w:rFonts w:ascii="Times New Roman" w:hAnsi="Times New Roman"/>
-          <w:sz w:val="24"/>
-        </w:rPr>
         <w:tab/>
-        <w:t>20</w:t>
+        <w:t>21</w:t>
+      </w:r>
+      <w:r>
+        <w:rPr>
+          <w:rFonts w:ascii="Times New Roman" w:hAnsi="Times New Roman"/>
+          <w:sz w:val="24"/>
+        </w:rPr>
       </w:r>
     </w:p>
     <w:p>
@@ -2013,14 +2032,14 @@
           <w:sz w:val="24"/>
         </w:rPr>
         <w:t>Chapter 5 RESULT AND DISCUSSION</w:t>
-      </w:r>
-      <w:r>
-        <w:rPr>
-          <w:rFonts w:ascii="Times New Roman" w:hAnsi="Times New Roman"/>
-          <w:sz w:val="24"/>
-        </w:rPr>
         <w:tab/>
-        <w:t>21</w:t>
+        <w:t>22</w:t>
+      </w:r>
+      <w:r>
+        <w:rPr>
+          <w:rFonts w:ascii="Times New Roman" w:hAnsi="Times New Roman"/>
+          <w:sz w:val="24"/>
+        </w:rPr>
       </w:r>
     </w:p>
     <w:p>
@@ -2038,14 +2057,14 @@
           <w:sz w:val="24"/>
         </w:rPr>
         <w:t>5.1  Output of the System</w:t>
-      </w:r>
-      <w:r>
-        <w:rPr>
-          <w:rFonts w:ascii="Times New Roman" w:hAnsi="Times New Roman"/>
-          <w:sz w:val="24"/>
-        </w:rPr>
         <w:tab/>
-        <w:t>21</w:t>
+        <w:t>22</w:t>
+      </w:r>
+      <w:r>
+        <w:rPr>
+          <w:rFonts w:ascii="Times New Roman" w:hAnsi="Times New Roman"/>
+          <w:sz w:val="24"/>
+        </w:rPr>
       </w:r>
     </w:p>
     <w:p>
@@ -2063,14 +2082,14 @@
           <w:sz w:val="24"/>
         </w:rPr>
         <w:t>5.2  Accuracy of the Two Engines</w:t>
-      </w:r>
-      <w:r>
-        <w:rPr>
-          <w:rFonts w:ascii="Times New Roman" w:hAnsi="Times New Roman"/>
-          <w:sz w:val="24"/>
-        </w:rPr>
         <w:tab/>
-        <w:t>21</w:t>
+        <w:t>22</w:t>
+      </w:r>
+      <w:r>
+        <w:rPr>
+          <w:rFonts w:ascii="Times New Roman" w:hAnsi="Times New Roman"/>
+          <w:sz w:val="24"/>
+        </w:rPr>
       </w:r>
     </w:p>
     <w:p>
@@ -2088,14 +2107,14 @@
           <w:sz w:val="24"/>
         </w:rPr>
         <w:t>5.3  Confusion Matrix</w:t>
-      </w:r>
-      <w:r>
-        <w:rPr>
-          <w:rFonts w:ascii="Times New Roman" w:hAnsi="Times New Roman"/>
-          <w:sz w:val="24"/>
-        </w:rPr>
         <w:tab/>
-        <w:t>23</w:t>
+        <w:t>24</w:t>
+      </w:r>
+      <w:r>
+        <w:rPr>
+          <w:rFonts w:ascii="Times New Roman" w:hAnsi="Times New Roman"/>
+          <w:sz w:val="24"/>
+        </w:rPr>
       </w:r>
     </w:p>
     <w:p>
@@ -2113,14 +2132,14 @@
           <w:sz w:val="24"/>
         </w:rPr>
         <w:t>5.4  The Threshold</w:t>
-      </w:r>
-      <w:r>
-        <w:rPr>
-          <w:rFonts w:ascii="Times New Roman" w:hAnsi="Times New Roman"/>
-          <w:sz w:val="24"/>
-        </w:rPr>
         <w:tab/>
-        <w:t>23</w:t>
+        <w:t>24</w:t>
+      </w:r>
+      <w:r>
+        <w:rPr>
+          <w:rFonts w:ascii="Times New Roman" w:hAnsi="Times New Roman"/>
+          <w:sz w:val="24"/>
+        </w:rPr>
       </w:r>
     </w:p>
     <w:p>
@@ -2138,14 +2157,14 @@
           <w:sz w:val="24"/>
         </w:rPr>
         <w:t>5.5  Speed of the Comparison</w:t>
-      </w:r>
-      <w:r>
-        <w:rPr>
-          <w:rFonts w:ascii="Times New Roman" w:hAnsi="Times New Roman"/>
-          <w:sz w:val="24"/>
-        </w:rPr>
         <w:tab/>
-        <w:t>24</w:t>
+        <w:t>25</w:t>
+      </w:r>
+      <w:r>
+        <w:rPr>
+          <w:rFonts w:ascii="Times New Roman" w:hAnsi="Times New Roman"/>
+          <w:sz w:val="24"/>
+        </w:rPr>
       </w:r>
     </w:p>
     <w:p>
@@ -2163,14 +2182,14 @@
           <w:sz w:val="24"/>
         </w:rPr>
         <w:t>5.6  Impact and Significance</w:t>
-      </w:r>
-      <w:r>
-        <w:rPr>
-          <w:rFonts w:ascii="Times New Roman" w:hAnsi="Times New Roman"/>
-          <w:sz w:val="24"/>
-        </w:rPr>
         <w:tab/>
-        <w:t>24</w:t>
+        <w:t>26</w:t>
+      </w:r>
+      <w:r>
+        <w:rPr>
+          <w:rFonts w:ascii="Times New Roman" w:hAnsi="Times New Roman"/>
+          <w:sz w:val="24"/>
+        </w:rPr>
       </w:r>
     </w:p>
     <w:p>
@@ -2188,14 +2207,14 @@
           <w:sz w:val="24"/>
         </w:rPr>
         <w:t>5.7  Limitations</w:t>
-      </w:r>
-      <w:r>
-        <w:rPr>
-          <w:rFonts w:ascii="Times New Roman" w:hAnsi="Times New Roman"/>
-          <w:sz w:val="24"/>
-        </w:rPr>
         <w:tab/>
-        <w:t>25</w:t>
+        <w:t>26</w:t>
+      </w:r>
+      <w:r>
+        <w:rPr>
+          <w:rFonts w:ascii="Times New Roman" w:hAnsi="Times New Roman"/>
+          <w:sz w:val="24"/>
+        </w:rPr>
       </w:r>
     </w:p>
     <w:p>
@@ -2213,14 +2232,14 @@
           <w:sz w:val="24"/>
         </w:rPr>
         <w:t>Chapter 6 CONCLUSION AND FUTURE WORKS</w:t>
-      </w:r>
-      <w:r>
-        <w:rPr>
-          <w:rFonts w:ascii="Times New Roman" w:hAnsi="Times New Roman"/>
-          <w:sz w:val="24"/>
-        </w:rPr>
         <w:tab/>
-        <w:t>26</w:t>
+        <w:t>27</w:t>
+      </w:r>
+      <w:r>
+        <w:rPr>
+          <w:rFonts w:ascii="Times New Roman" w:hAnsi="Times New Roman"/>
+          <w:sz w:val="24"/>
+        </w:rPr>
       </w:r>
     </w:p>
     <w:p>
@@ -2238,14 +2257,14 @@
           <w:sz w:val="24"/>
         </w:rPr>
         <w:t>BIBLIOGRAPHY</w:t>
-      </w:r>
-      <w:r>
-        <w:rPr>
-          <w:rFonts w:ascii="Times New Roman" w:hAnsi="Times New Roman"/>
-          <w:sz w:val="24"/>
-        </w:rPr>
         <w:tab/>
-        <w:t>28</w:t>
+        <w:t>29</w:t>
+      </w:r>
+      <w:r>
+        <w:rPr>
+          <w:rFonts w:ascii="Times New Roman" w:hAnsi="Times New Roman"/>
+          <w:sz w:val="24"/>
+        </w:rPr>
       </w:r>
     </w:p>
     <w:p>
@@ -2263,14 +2282,14 @@
           <w:sz w:val="24"/>
         </w:rPr>
         <w:t>ANNEXES</w:t>
-      </w:r>
-      <w:r>
-        <w:rPr>
-          <w:rFonts w:ascii="Times New Roman" w:hAnsi="Times New Roman"/>
-          <w:sz w:val="24"/>
-        </w:rPr>
         <w:tab/>
-        <w:t>30</w:t>
+        <w:t>31</w:t>
+      </w:r>
+      <w:r>
+        <w:rPr>
+          <w:rFonts w:ascii="Times New Roman" w:hAnsi="Times New Roman"/>
+          <w:sz w:val="24"/>
+        </w:rPr>
       </w:r>
     </w:p>
     <w:p>
@@ -2433,7 +2452,7 @@
           <w:b w:val="0"/>
           <w:sz w:val="24"/>
         </w:rPr>
-        <w:t>Figure 6: Timeline chart of the ten weekly sprints</w:t>
+        <w:t>Figure 6: Timeline chart of the ten sprints</w:t>
       </w:r>
       <w:r>
         <w:rPr>
@@ -2459,14 +2478,14 @@
           <w:sz w:val="24"/>
         </w:rPr>
         <w:t>Figure 7: Accuracy of the three engines on both evaluation sets</w:t>
-      </w:r>
-      <w:r>
-        <w:rPr>
-          <w:rFonts w:ascii="Times New Roman" w:hAnsi="Times New Roman"/>
-          <w:sz w:val="24"/>
-        </w:rPr>
         <w:tab/>
-        <w:t>22</w:t>
+        <w:t>23</w:t>
+      </w:r>
+      <w:r>
+        <w:rPr>
+          <w:rFonts w:ascii="Times New Roman" w:hAnsi="Times New Roman"/>
+          <w:sz w:val="24"/>
+        </w:rPr>
       </w:r>
     </w:p>
     <w:p>
@@ -2484,14 +2503,14 @@
           <w:sz w:val="24"/>
         </w:rPr>
         <w:t>Figure 8: Comparison time before and after the optimisation</w:t>
-      </w:r>
-      <w:r>
-        <w:rPr>
-          <w:rFonts w:ascii="Times New Roman" w:hAnsi="Times New Roman"/>
-          <w:sz w:val="24"/>
-        </w:rPr>
         <w:tab/>
-        <w:t>24</w:t>
+        <w:t>25</w:t>
+      </w:r>
+      <w:r>
+        <w:rPr>
+          <w:rFonts w:ascii="Times New Roman" w:hAnsi="Times New Roman"/>
+          <w:sz w:val="24"/>
+        </w:rPr>
       </w:r>
     </w:p>
     <w:p>
@@ -2604,7 +2623,7 @@
           <w:b w:val="0"/>
           <w:sz w:val="24"/>
         </w:rPr>
-        <w:t>Table 4: Sprint deliverables of the ten weekly sprints</w:t>
+        <w:t>Table 4: Sprint deliverables of the ten sprints</w:t>
       </w:r>
       <w:r>
         <w:rPr>
@@ -2655,14 +2674,14 @@
           <w:sz w:val="24"/>
         </w:rPr>
         <w:t>Table 6: Unit tests written for the services</w:t>
-      </w:r>
-      <w:r>
-        <w:rPr>
-          <w:rFonts w:ascii="Times New Roman" w:hAnsi="Times New Roman"/>
-          <w:sz w:val="24"/>
-        </w:rPr>
         <w:tab/>
-        <w:t>18</w:t>
+        <w:t>19</w:t>
+      </w:r>
+      <w:r>
+        <w:rPr>
+          <w:rFonts w:ascii="Times New Roman" w:hAnsi="Times New Roman"/>
+          <w:sz w:val="24"/>
+        </w:rPr>
       </w:r>
     </w:p>
     <w:p>
@@ -2680,14 +2699,14 @@
           <w:sz w:val="24"/>
         </w:rPr>
         <w:t>Table 7: Functional test cases</w:t>
-      </w:r>
-      <w:r>
-        <w:rPr>
-          <w:rFonts w:ascii="Times New Roman" w:hAnsi="Times New Roman"/>
-          <w:sz w:val="24"/>
-        </w:rPr>
         <w:tab/>
-        <w:t>19</w:t>
+        <w:t>20</w:t>
+      </w:r>
+      <w:r>
+        <w:rPr>
+          <w:rFonts w:ascii="Times New Roman" w:hAnsi="Times New Roman"/>
+          <w:sz w:val="24"/>
+        </w:rPr>
       </w:r>
     </w:p>
     <w:p>
@@ -2705,14 +2724,14 @@
           <w:sz w:val="24"/>
         </w:rPr>
         <w:t>Table 8: Similarity scores produced for the sample documents</w:t>
-      </w:r>
-      <w:r>
-        <w:rPr>
-          <w:rFonts w:ascii="Times New Roman" w:hAnsi="Times New Roman"/>
-          <w:sz w:val="24"/>
-        </w:rPr>
         <w:tab/>
-        <w:t>21</w:t>
+        <w:t>22</w:t>
+      </w:r>
+      <w:r>
+        <w:rPr>
+          <w:rFonts w:ascii="Times New Roman" w:hAnsi="Times New Roman"/>
+          <w:sz w:val="24"/>
+        </w:rPr>
       </w:r>
     </w:p>
     <w:p>
@@ -2730,14 +2749,14 @@
           <w:sz w:val="24"/>
         </w:rPr>
         <w:t>Table 9: Accuracy of the engines on the two evaluation sets</w:t>
-      </w:r>
-      <w:r>
-        <w:rPr>
-          <w:rFonts w:ascii="Times New Roman" w:hAnsi="Times New Roman"/>
-          <w:sz w:val="24"/>
-        </w:rPr>
         <w:tab/>
-        <w:t>21</w:t>
+        <w:t>23</w:t>
+      </w:r>
+      <w:r>
+        <w:rPr>
+          <w:rFonts w:ascii="Times New Roman" w:hAnsi="Times New Roman"/>
+          <w:sz w:val="24"/>
+        </w:rPr>
       </w:r>
     </w:p>
     <w:p>
@@ -2755,14 +2774,14 @@
           <w:sz w:val="24"/>
         </w:rPr>
         <w:t>Table 10: Confusion matrix of the three engines on the in-domain set</w:t>
-      </w:r>
-      <w:r>
-        <w:rPr>
-          <w:rFonts w:ascii="Times New Roman" w:hAnsi="Times New Roman"/>
-          <w:sz w:val="24"/>
-        </w:rPr>
         <w:tab/>
-        <w:t>23</w:t>
+        <w:t>24</w:t>
+      </w:r>
+      <w:r>
+        <w:rPr>
+          <w:rFonts w:ascii="Times New Roman" w:hAnsi="Times New Roman"/>
+          <w:sz w:val="24"/>
+        </w:rPr>
       </w:r>
     </w:p>
     <w:p>
@@ -2780,14 +2799,14 @@
           <w:sz w:val="24"/>
         </w:rPr>
         <w:t>Table 11: Comparison time before and after the optimisation</w:t>
-      </w:r>
-      <w:r>
-        <w:rPr>
-          <w:rFonts w:ascii="Times New Roman" w:hAnsi="Times New Roman"/>
-          <w:sz w:val="24"/>
-        </w:rPr>
         <w:tab/>
-        <w:t>24</w:t>
+        <w:t>25</w:t>
+      </w:r>
+      <w:r>
+        <w:rPr>
+          <w:rFonts w:ascii="Times New Roman" w:hAnsi="Times New Roman"/>
+          <w:sz w:val="24"/>
+        </w:rPr>
       </w:r>
     </w:p>
     <w:p>
@@ -3066,7 +3085,7 @@
           <w:i w:val="0"/>
           <w:sz w:val="24"/>
         </w:rPr>
-        <w:t>Five steps, and each one is its own module in the code. We split it that way so that any single step can be tested, replaced or explained to the panel without dragging the rest of the system into the conversation.</w:t>
+        <w:t>Five steps, and each one is its own module in the code. We split it that way so that any single step can be tested, replaced or explained on its own without dragging the rest of the system into the conversation.</w:t>
       </w:r>
     </w:p>
     <w:p>
@@ -3499,7 +3518,7 @@
           <w:i w:val="0"/>
           <w:sz w:val="24"/>
         </w:rPr>
-        <w:t>Training this kind of model means finding labelled pairs, and there are fewer good options than we expected. The Quora Question Pairs corpus [6] carries roughly four hundred thousand pairs marked duplicate or not. The Microsoft Research Paraphrase Corpus [5], part of GLUE [15], holds sentence pairs pulled from news text and marked as paraphrase or not. Clough and Stevenson [7] assembled something closer to our actual situation, short answers copied deliberately at four different levels, but it runs to about a hundred documents and you cannot train on that. We train on Quora and then evaluate on both corpora, one the model has seen and one it has not, which turned out to be the most informative decision in the whole project.</w:t>
+        <w:t>Training this kind of model means finding labelled pairs, and there are fewer good options than we expected. The Quora Question Pairs corpus [6] carries roughly four hundred thousand pairs marked duplicate or not. The Microsoft Research Paraphrase Corpus [5], part of GLUE [14], holds sentence pairs pulled from news text and marked as paraphrase or not. Clough and Stevenson [7] assembled something closer to our actual situation, short answers copied deliberately at four different levels, but it runs to about a hundred documents and you cannot train on that. We train on Quora and then evaluate on both corpora, one the model has seen and one it has not, which turned out to be the most informative decision in the whole project.</w:t>
       </w:r>
     </w:p>
     <w:p>
@@ -4789,7 +4808,7 @@
           <w:i w:val="0"/>
           <w:sz w:val="24"/>
         </w:rPr>
-        <w:t>We worked in one week sprints. The requirement was clear from day one, but the design was not, and on the machine learning side it could not have been: which model, which corpus, which threshold, none of these can be argued into place and all of them had to be settled by running something and looking at the number that came back. Short sprints with a review at the end suited that. Ten sprints ran between 8 June 2026 and 10 August 2026. Each one closed with a meeting with our supervisor, and the minute of that meeting records what was finished and what was assigned for the week ahead.</w:t>
+        <w:t>We worked in short sprints. The requirement was clear from day one, but the design was not, and on the machine learning side it could not have been: which model, which corpus, which threshold, none of these can be argued into place and all of them had to be settled by running something and looking at the number that came back. Short sprints with a review at the end suited that. Ten sprints ran between 8 June 2026 and 11 August 2026, weekly through the design and core development phases and then deliberately shortened over the last five, when the work was integration and measurement and we met as soon as there was something to show rather than waiting for the week to close. Each one closed with a meeting with our supervisor, and the minute of that meeting records what was finished and what was assigned for the sprint ahead.</w:t>
       </w:r>
     </w:p>
     <w:p>
@@ -5470,7 +5489,7 @@
           <w:i w:val="0"/>
           <w:sz w:val="24"/>
         </w:rPr>
-        <w:t>Every sprint ended the same way. We demonstrated what was working, the achievements of each member went into the minute, and the tasks for the following week were handed out before anyone left the room. The table lists what each sprint delivered. The commit history in the repository follows the same order and carries the same dates, so anything claimed in this table can be checked against the code rather than taken on trust.</w:t>
+        <w:t>Every sprint ended the same way. We demonstrated what was working, the achievements of each member went into the minute, and the tasks for the following sprint were handed out before anyone left the room. The table lists what each sprint delivered. The commit history in the repository follows the same order and carries the same dates, so anything claimed in this table can be checked against the code rather than taken on trust.</w:t>
       </w:r>
     </w:p>
     <w:p>
@@ -5485,7 +5504,7 @@
           <w:i w:val="0"/>
           <w:sz w:val="22"/>
         </w:rPr>
-        <w:t>Table 4: Sprint deliverables of the ten weekly sprints</w:t>
+        <w:t>Table 4: Sprint deliverables of the ten sprints</w:t>
       </w:r>
     </w:p>
     <w:tbl>
@@ -5535,7 +5554,7 @@
                 <w:b/>
                 <w:sz w:val="21"/>
               </w:rPr>
-              <w:t>Week ending</w:t>
+              <w:t>Sprint ending</w:t>
             </w:r>
           </w:p>
         </w:tc>
@@ -5889,7 +5908,7 @@
                 <w:b w:val="0"/>
                 <w:sz w:val="21"/>
               </w:rPr>
-              <w:t>13 Jul 2026</w:t>
+              <w:t>24 Jul 2026</w:t>
             </w:r>
           </w:p>
         </w:tc>
@@ -5948,7 +5967,7 @@
                 <w:b w:val="0"/>
                 <w:sz w:val="21"/>
               </w:rPr>
-              <w:t>20 Jul 2026</w:t>
+              <w:t>29 Jul 2026</w:t>
             </w:r>
           </w:p>
         </w:tc>
@@ -6007,7 +6026,7 @@
                 <w:b w:val="0"/>
                 <w:sz w:val="21"/>
               </w:rPr>
-              <w:t>27 Jul 2026</w:t>
+              <w:t>02 Aug 2026</w:t>
             </w:r>
           </w:p>
         </w:tc>
@@ -6066,7 +6085,7 @@
                 <w:b w:val="0"/>
                 <w:sz w:val="21"/>
               </w:rPr>
-              <w:t>03 Aug 2026</w:t>
+              <w:t>06 Aug 2026</w:t>
             </w:r>
           </w:p>
         </w:tc>
@@ -6125,7 +6144,7 @@
                 <w:b w:val="0"/>
                 <w:sz w:val="21"/>
               </w:rPr>
-              <w:t>10 Aug 2026</w:t>
+              <w:t>11 Aug 2026</w:t>
             </w:r>
           </w:p>
         </w:tc>
@@ -6713,7 +6732,7 @@
           <w:rFonts w:ascii="Times New Roman" w:hAnsi="Times New Roman"/>
           <w:sz w:val="24"/>
         </w:rPr>
-        <w:t>The user selects Sentence-BERT or TF-IDF and moves the threshold slider; the values are sent with the request and are echoed back in the response.</w:t>
+        <w:t>The user selects Sentence-BERT or TF-IDF and moves the threshold slider; both values are sent with the batch comparison request and are echoed back in the response.</w:t>
       </w:r>
     </w:p>
     <w:p>
@@ -6808,7 +6827,7 @@
           <w:rFonts w:ascii="Times New Roman" w:hAnsi="Times New Roman"/>
           <w:sz w:val="24"/>
         </w:rPr>
-        <w:t>The user presses the export control; the matrix, the scores and the highlighted sentences are laid out for printing and the browser print dialogue is opened.</w:t>
+        <w:t>The user presses the export control; the matrix, the scores and the highlighted sentences are laid out for printing and the browser print dialogue is opened. This case was designed in sprint 2 and is the one use case in Figure 2 that the delivered version does not implement; it is recorded again in section 5.7.</w:t>
       </w:r>
     </w:p>
     <w:p>
@@ -7097,7 +7116,7 @@
           <w:i w:val="0"/>
           <w:sz w:val="22"/>
         </w:rPr>
-        <w:t>Figure 6: Timeline chart of the ten weekly sprints</w:t>
+        <w:t>Figure 6: Timeline chart of the ten sprints</w:t>
       </w:r>
     </w:p>
     <w:p>
@@ -7142,7 +7161,7 @@
           <w:i w:val="0"/>
           <w:sz w:val="24"/>
         </w:rPr>
-        <w:t>Training runs from a single script, train.py, which downloads the corpus, fine tunes the model and writes the checkpoint that the backend then picks up on its own. We took thirty thousand labelled pairs from the Quora Question Pairs corpus [6] and split them twenty seven thousand for training against three thousand held back. One epoch, batch size thirty two, warm up over the first ten percent of the steps. On the held out split the fine tuned model scored an accuracy of 0.800 at the 0.70 threshold. Chapter 5 carries the full evaluation, including the baseline and a second corpus the model had never seen.</w:t>
+        <w:t>Training runs from a single script, train.py, which downloads the corpus, fine tunes the model and writes the checkpoint that the backend then picks up on its own. We took thirty thousand labelled pairs from the Quora Question Pairs corpus [6] and split them twenty seven thousand for training against three thousand held back. One epoch, batch size thirty two, warm up over the first ten percent of the steps. On the three thousand pairs held back from training, the fine tuned model scored an accuracy of 0.800 at the 0.70 threshold. Chapter 5 reports 0.826 for the same model, measured on the official Quora validation split rather than on this hold out, and carries the full evaluation including the baseline and a second corpus the model had never seen.</w:t>
       </w:r>
     </w:p>
     <w:p>
@@ -7559,6 +7578,83 @@
           <w:sz w:val="24"/>
         </w:rPr>
         <w:t>Nepali is not English in a different alphabet, and assuming it was cost us a sprint. Three things had to change. A sentence in Devanagari closes with the danda, so the splitter now treats that character as an ending whether or not a space follows it, and quite often there is no space. The tokenizer behind the baseline engine matched Latin letters and digits only, which meant it returned an empty list for Nepali text and reported a similarity of zero for two identical Nepali documents. We widened its pattern to the Devanagari range and added the common Nepali function words to the stopword list. Tesseract gets the Nepali training data when the machine has it and falls back to English when it does not, and that check happens once and is then remembered.</w:t>
+      </w:r>
+    </w:p>
+    <w:p>
+      <w:pPr>
+        <w:keepNext/>
+        <w:spacing w:before="120" w:after="80" w:line="360" w:lineRule="auto"/>
+      </w:pPr>
+      <w:r>
+        <w:rPr>
+          <w:rFonts w:ascii="Times New Roman" w:hAnsi="Times New Roman"/>
+          <w:b/>
+          <w:i w:val="0"/>
+          <w:sz w:val="24"/>
+        </w:rPr>
+        <w:t>3.2.10</w:t>
+        <w:tab/>
+        <w:t>Division of Work</w:t>
+      </w:r>
+    </w:p>
+    <w:p>
+      <w:pPr>
+        <w:spacing w:before="0" w:after="120" w:line="360" w:lineRule="auto"/>
+        <w:jc w:val="both"/>
+      </w:pPr>
+      <w:r>
+        <w:rPr>
+          <w:rFonts w:ascii="Times New Roman" w:hAnsi="Times New Roman"/>
+          <w:b w:val="0"/>
+          <w:i w:val="0"/>
+          <w:sz w:val="24"/>
+        </w:rPr>
+        <w:t>The three of us split the system along the lines that the module division had already drawn, so that each part could be built and tested without waiting on the other two. The dataset work was the exception and was done by all three of us together: we compared the available labelled corpora, settled on the Quora Question Pairs corpus for training and the Microsoft Research Paraphrase Corpus for testing the transfer, and prepared the sample documents, the Nepali text and the scanned pages that the system is demonstrated and tested with.</w:t>
+      </w:r>
+    </w:p>
+    <w:p>
+      <w:pPr>
+        <w:spacing w:before="0" w:after="120" w:line="360" w:lineRule="auto"/>
+        <w:jc w:val="both"/>
+      </w:pPr>
+      <w:r>
+        <w:rPr>
+          <w:rFonts w:ascii="Times New Roman" w:hAnsi="Times New Roman"/>
+          <w:b w:val="0"/>
+          <w:i w:val="0"/>
+          <w:sz w:val="24"/>
+        </w:rPr>
+        <w:t>Neon Neupane took the backend and the integration. That covers the Django project and the three endpoints, the upload path that reads a file in memory and routes it to the right extractor, the text extraction service with Tesseract OCR for images and for scanned PDF files, the preprocessing utilities including the Devanagari handling, the chunked and batched encoding with the sentence cache that made the comparison five times faster, the error handling that answers every unreadable upload with a message the user can act on, and the wiring of the five services into one request pipeline. The unit tests, the user manual and the acceptance testing were also his.</w:t>
+      </w:r>
+    </w:p>
+    <w:p>
+      <w:pPr>
+        <w:spacing w:before="0" w:after="120" w:line="360" w:lineRule="auto"/>
+        <w:jc w:val="both"/>
+      </w:pPr>
+      <w:r>
+        <w:rPr>
+          <w:rFonts w:ascii="Times New Roman" w:hAnsi="Times New Roman"/>
+          <w:b w:val="0"/>
+          <w:i w:val="0"/>
+          <w:sz w:val="24"/>
+        </w:rPr>
+        <w:t>Bishal Acharya took the model. He reviewed the text similarity techniques and selected Sentence-BERT with the all-MiniLM-L6-v2 base, fine tuned it on the Quora corpus with the Siamese arrangement and the cosine similarity loss, wrote the TF-IDF baseline from scratch with PyTorch tensors so that the trained model could be measured against something, built the two engines behind one shared cosine helper, proposed and wrote the web scraping check, and produced the evaluation of the three engines on both corpora that Chapter 5 reports.</w:t>
+      </w:r>
+    </w:p>
+    <w:p>
+      <w:pPr>
+        <w:spacing w:before="0" w:after="120" w:line="360" w:lineRule="auto"/>
+        <w:jc w:val="both"/>
+      </w:pPr>
+      <w:r>
+        <w:rPr>
+          <w:rFonts w:ascii="Times New Roman" w:hAnsi="Times New Roman"/>
+          <w:b w:val="0"/>
+          <w:i w:val="0"/>
+          <w:sz w:val="24"/>
+        </w:rPr>
+        <w:t>Nabin Giri took the whole frontend. That is the React and Vite application with its Tailwind theme, the drag and drop uploader with its validation, the similarity matrix with its colour coded cells and its legend, the view that marks the copied sentences inside the document, the list of sentence matches with their scores, the web check result view, the engine and the threshold controls, and the responsive layout that keeps the matrix readable on a small screen.</w:t>
       </w:r>
     </w:p>
     <w:p>
@@ -8784,14 +8880,12 @@
             <w:pPr>
               <w:spacing w:line="276" w:lineRule="auto" w:after="40" w:before="40"/>
             </w:pPr>
-            <w:r/>
             <w:r>
               <w:rPr>
                 <w:rFonts w:ascii="Times New Roman" w:hAnsi="Times New Roman"/>
-                <w:b w:val="0"/>
                 <w:sz w:val="20"/>
               </w:rPr>
-              <w:t>Original and its paraphrase</w:t>
+              <w:t>Original and its reworded copy</w:t>
             </w:r>
           </w:p>
         </w:tc>
@@ -8803,14 +8897,12 @@
             <w:pPr>
               <w:spacing w:line="276" w:lineRule="auto" w:after="40" w:before="40"/>
             </w:pPr>
-            <w:r/>
             <w:r>
               <w:rPr>
                 <w:rFonts w:ascii="Times New Roman" w:hAnsi="Times New Roman"/>
-                <w:b w:val="0"/>
                 <w:sz w:val="20"/>
               </w:rPr>
-              <w:t>Flagged, with the reworded sentences marked</w:t>
+              <w:t>Flagged, with the reworded sentences marked. A heavier rewrite of the same passage falls below the 0.70 default and flags at 0.50.</w:t>
             </w:r>
           </w:p>
         </w:tc>
@@ -9378,7 +9470,7 @@
           <w:i w:val="0"/>
           <w:sz w:val="24"/>
         </w:rPr>
-        <w:t>The sample set in the repository holds four files: an original passage about photosynthesis, a paraphrase of it with almost every word swapped, an unrelated passage and a Nepali document. Putting all four through the system produces the scores below. Both engines separate the paraphrased pair from the unrelated ones, so at first glance both look fine. The size of the gap is what actually matters. The baseline scores the paraphrase at 0.47, and it only gets that far because a handful of words survived the rewriting. The trained model sees that the two passages are saying the same thing.</w:t>
+        <w:t>The sample set in the repository holds four files: an original passage about photosynthesis, a paraphrase of it with almost every word swapped, an unrelated passage and a Nepali document. Putting all four through the system produces the scores below. Both engines separate the paraphrased pair from the unrelated ones, so at first glance both look fine. The size of the gap is what actually matters. The baseline scores the paraphrase at 0.47, and it only gets that far because a handful of words survived the rewriting. The trained model puts the same pair at 0.67 and marks one of its four sentences as copied.</w:t>
       </w:r>
     </w:p>
     <w:p>
@@ -9812,7 +9904,7 @@
           <w:i w:val="0"/>
           <w:sz w:val="24"/>
         </w:rPr>
-        <w:t>One number here surprised us. The same pair scores 0.8960 under the pretrained model and 0.6676 under our fine tuned one, which looks at first like the training made things worse. It did not. The scale moved. Section 5.4 works through what happened, because it decides which threshold belongs with which model.</w:t>
+        <w:t>One number here surprised us. The same pair scores 0.8960 under the pretrained model and 0.6676 under our fine tuned one, which looks at first like the training made things worse. It did not. The scale moved, which is also why our score on this particular pair sits just under the default threshold of 0.70. Section 5.4 works through what happened, because it decides which threshold belongs with which model.</w:t>
       </w:r>
     </w:p>
     <w:p>
@@ -11743,6 +11835,20 @@
       </w:r>
     </w:p>
     <w:p>
+      <w:pPr>
+        <w:pStyle w:val="ListBullet"/>
+        <w:spacing w:line="360" w:lineRule="auto" w:after="40"/>
+        <w:ind w:left="576"/>
+      </w:pPr>
+      <w:r>
+        <w:rPr>
+          <w:rFonts w:ascii="Times New Roman" w:hAnsi="Times New Roman"/>
+          <w:sz w:val="24"/>
+        </w:rPr>
+        <w:t>Exporting a result as a printable report was designed as UC6 but was not implemented. A result can be read on the screen and nowhere else.</w:t>
+      </w:r>
+    </w:p>
+    <w:p>
       <w:r>
         <w:br w:type="page"/>
       </w:r>
@@ -11791,7 +11897,7 @@
           <w:i w:val="0"/>
           <w:sz w:val="24"/>
         </w:rPr>
-        <w:t>We set out to build a free plagiarism detector that compares meaning instead of words. That is done, and unlike most claims of this sort it has been measured. The finished system takes PDF, DOCX, TXT and scanned images in English and in Nepali, compares a batch of documents against each other and any single document against public web pages, returns a similarity matrix along with the percentage copied, and marks the offending sentences inside the text itself. No login, no cost, nothing kept afterwards.</w:t>
+        <w:t>We set out to build a free plagiarism detector that compares meaning instead of words. That is done, and it has been measured rather than asserted. The finished system takes PDF, DOCX, TXT and scanned images in English and in Nepali, compares a batch of documents against each other and any single document against public web pages, returns a similarity matrix along with the percentage copied, and marks the offending sentences inside the text itself. No login, no cost, nothing kept afterwards.</w:t>
       </w:r>
     </w:p>
     <w:p>

</xml_diff>

<commit_message>
Make the objectives specific and measurable
</commit_message>
<xml_diff>
--- a/report/Project_II_Report_Plagiarism_Detector.docx
+++ b/report/Project_II_Report_Plagiarism_Detector.docx
@@ -1463,14 +1463,14 @@
           <w:sz w:val="24"/>
         </w:rPr>
         <w:t>1.4  How Our System Works</w:t>
-      </w:r>
-      <w:r>
-        <w:rPr>
-          <w:rFonts w:ascii="Times New Roman" w:hAnsi="Times New Roman"/>
-          <w:sz w:val="24"/>
-        </w:rPr>
         <w:tab/>
-        <w:t>2</w:t>
+        <w:t>3</w:t>
+      </w:r>
+      <w:r>
+        <w:rPr>
+          <w:rFonts w:ascii="Times New Roman" w:hAnsi="Times New Roman"/>
+          <w:sz w:val="24"/>
+        </w:rPr>
       </w:r>
     </w:p>
     <w:p>
@@ -1488,14 +1488,14 @@
           <w:sz w:val="24"/>
         </w:rPr>
         <w:t>Chapter 2 LITERATURE REVIEW</w:t>
-      </w:r>
-      <w:r>
-        <w:rPr>
-          <w:rFonts w:ascii="Times New Roman" w:hAnsi="Times New Roman"/>
-          <w:sz w:val="24"/>
-        </w:rPr>
         <w:tab/>
-        <w:t>4</w:t>
+        <w:t>5</w:t>
+      </w:r>
+      <w:r>
+        <w:rPr>
+          <w:rFonts w:ascii="Times New Roman" w:hAnsi="Times New Roman"/>
+          <w:sz w:val="24"/>
+        </w:rPr>
       </w:r>
     </w:p>
     <w:p>
@@ -1513,14 +1513,14 @@
           <w:sz w:val="24"/>
         </w:rPr>
         <w:t>2.1  Theoretical Foundations</w:t>
-      </w:r>
-      <w:r>
-        <w:rPr>
-          <w:rFonts w:ascii="Times New Roman" w:hAnsi="Times New Roman"/>
-          <w:sz w:val="24"/>
-        </w:rPr>
         <w:tab/>
-        <w:t>4</w:t>
+        <w:t>5</w:t>
+      </w:r>
+      <w:r>
+        <w:rPr>
+          <w:rFonts w:ascii="Times New Roman" w:hAnsi="Times New Roman"/>
+          <w:sz w:val="24"/>
+        </w:rPr>
       </w:r>
     </w:p>
     <w:p>
@@ -1538,14 +1538,14 @@
           <w:sz w:val="24"/>
         </w:rPr>
         <w:t>2.2  Gap in Literature</w:t>
-      </w:r>
-      <w:r>
-        <w:rPr>
-          <w:rFonts w:ascii="Times New Roman" w:hAnsi="Times New Roman"/>
-          <w:sz w:val="24"/>
-        </w:rPr>
         <w:tab/>
-        <w:t>5</w:t>
+        <w:t>6</w:t>
+      </w:r>
+      <w:r>
+        <w:rPr>
+          <w:rFonts w:ascii="Times New Roman" w:hAnsi="Times New Roman"/>
+          <w:sz w:val="24"/>
+        </w:rPr>
       </w:r>
     </w:p>
     <w:p>
@@ -1563,14 +1563,14 @@
           <w:sz w:val="24"/>
         </w:rPr>
         <w:t>2.3  Review of Related Works</w:t>
-      </w:r>
-      <w:r>
-        <w:rPr>
-          <w:rFonts w:ascii="Times New Roman" w:hAnsi="Times New Roman"/>
-          <w:sz w:val="24"/>
-        </w:rPr>
         <w:tab/>
-        <w:t>6</w:t>
+        <w:t>7</w:t>
+      </w:r>
+      <w:r>
+        <w:rPr>
+          <w:rFonts w:ascii="Times New Roman" w:hAnsi="Times New Roman"/>
+          <w:sz w:val="24"/>
+        </w:rPr>
       </w:r>
     </w:p>
     <w:p>
@@ -1588,14 +1588,14 @@
           <w:sz w:val="24"/>
         </w:rPr>
         <w:t>Chapter 3 TOOLS AND METHODOLOGY</w:t>
-      </w:r>
-      <w:r>
-        <w:rPr>
-          <w:rFonts w:ascii="Times New Roman" w:hAnsi="Times New Roman"/>
-          <w:sz w:val="24"/>
-        </w:rPr>
         <w:tab/>
-        <w:t>7</w:t>
+        <w:t>8</w:t>
+      </w:r>
+      <w:r>
+        <w:rPr>
+          <w:rFonts w:ascii="Times New Roman" w:hAnsi="Times New Roman"/>
+          <w:sz w:val="24"/>
+        </w:rPr>
       </w:r>
     </w:p>
     <w:p>
@@ -1613,14 +1613,14 @@
           <w:sz w:val="24"/>
         </w:rPr>
         <w:t>3.1  Required Tools</w:t>
-      </w:r>
-      <w:r>
-        <w:rPr>
-          <w:rFonts w:ascii="Times New Roman" w:hAnsi="Times New Roman"/>
-          <w:sz w:val="24"/>
-        </w:rPr>
         <w:tab/>
-        <w:t>7</w:t>
+        <w:t>8</w:t>
+      </w:r>
+      <w:r>
+        <w:rPr>
+          <w:rFonts w:ascii="Times New Roman" w:hAnsi="Times New Roman"/>
+          <w:sz w:val="24"/>
+        </w:rPr>
       </w:r>
     </w:p>
     <w:p>
@@ -1638,14 +1638,14 @@
           <w:sz w:val="24"/>
         </w:rPr>
         <w:t>3.2  Methodology</w:t>
-      </w:r>
-      <w:r>
-        <w:rPr>
-          <w:rFonts w:ascii="Times New Roman" w:hAnsi="Times New Roman"/>
-          <w:sz w:val="24"/>
-        </w:rPr>
         <w:tab/>
-        <w:t>7</w:t>
+        <w:t>8</w:t>
+      </w:r>
+      <w:r>
+        <w:rPr>
+          <w:rFonts w:ascii="Times New Roman" w:hAnsi="Times New Roman"/>
+          <w:sz w:val="24"/>
+        </w:rPr>
       </w:r>
     </w:p>
     <w:p>
@@ -1663,14 +1663,14 @@
           <w:sz w:val="24"/>
         </w:rPr>
         <w:t>3.2.1  System Development Approach</w:t>
-      </w:r>
-      <w:r>
-        <w:rPr>
-          <w:rFonts w:ascii="Times New Roman" w:hAnsi="Times New Roman"/>
-          <w:sz w:val="24"/>
-        </w:rPr>
         <w:tab/>
-        <w:t>7</w:t>
+        <w:t>8</w:t>
+      </w:r>
+      <w:r>
+        <w:rPr>
+          <w:rFonts w:ascii="Times New Roman" w:hAnsi="Times New Roman"/>
+          <w:sz w:val="24"/>
+        </w:rPr>
       </w:r>
     </w:p>
     <w:p>
@@ -1688,14 +1688,14 @@
           <w:sz w:val="24"/>
         </w:rPr>
         <w:t>3.2.2  Implementation Process</w:t>
-      </w:r>
-      <w:r>
-        <w:rPr>
-          <w:rFonts w:ascii="Times New Roman" w:hAnsi="Times New Roman"/>
-          <w:sz w:val="24"/>
-        </w:rPr>
         <w:tab/>
-        <w:t>8</w:t>
+        <w:t>9</w:t>
+      </w:r>
+      <w:r>
+        <w:rPr>
+          <w:rFonts w:ascii="Times New Roman" w:hAnsi="Times New Roman"/>
+          <w:sz w:val="24"/>
+        </w:rPr>
       </w:r>
     </w:p>
     <w:p>
@@ -1713,14 +1713,14 @@
           <w:sz w:val="24"/>
         </w:rPr>
         <w:t>3.2.3  Technologies Used</w:t>
-      </w:r>
-      <w:r>
-        <w:rPr>
-          <w:rFonts w:ascii="Times New Roman" w:hAnsi="Times New Roman"/>
-          <w:sz w:val="24"/>
-        </w:rPr>
         <w:tab/>
-        <w:t>9</w:t>
+        <w:t>10</w:t>
+      </w:r>
+      <w:r>
+        <w:rPr>
+          <w:rFonts w:ascii="Times New Roman" w:hAnsi="Times New Roman"/>
+          <w:sz w:val="24"/>
+        </w:rPr>
       </w:r>
     </w:p>
     <w:p>
@@ -1738,14 +1738,14 @@
           <w:sz w:val="24"/>
         </w:rPr>
         <w:t>3.2.4  System Architecture</w:t>
-      </w:r>
-      <w:r>
-        <w:rPr>
-          <w:rFonts w:ascii="Times New Roman" w:hAnsi="Times New Roman"/>
-          <w:sz w:val="24"/>
-        </w:rPr>
         <w:tab/>
-        <w:t>9</w:t>
+        <w:t>10</w:t>
+      </w:r>
+      <w:r>
+        <w:rPr>
+          <w:rFonts w:ascii="Times New Roman" w:hAnsi="Times New Roman"/>
+          <w:sz w:val="24"/>
+        </w:rPr>
       </w:r>
     </w:p>
     <w:p>
@@ -1763,14 +1763,14 @@
           <w:sz w:val="24"/>
         </w:rPr>
         <w:t>3.2.5  Agile Implementation</w:t>
-      </w:r>
-      <w:r>
-        <w:rPr>
-          <w:rFonts w:ascii="Times New Roman" w:hAnsi="Times New Roman"/>
-          <w:sz w:val="24"/>
-        </w:rPr>
         <w:tab/>
-        <w:t>10</w:t>
+        <w:t>11</w:t>
+      </w:r>
+      <w:r>
+        <w:rPr>
+          <w:rFonts w:ascii="Times New Roman" w:hAnsi="Times New Roman"/>
+          <w:sz w:val="24"/>
+        </w:rPr>
       </w:r>
     </w:p>
     <w:p>
@@ -1788,14 +1788,14 @@
           <w:sz w:val="24"/>
         </w:rPr>
         <w:t>3.2.6  Designs</w:t>
-      </w:r>
-      <w:r>
-        <w:rPr>
-          <w:rFonts w:ascii="Times New Roman" w:hAnsi="Times New Roman"/>
-          <w:sz w:val="24"/>
-        </w:rPr>
         <w:tab/>
-        <w:t>12</w:t>
+        <w:t>13</w:t>
+      </w:r>
+      <w:r>
+        <w:rPr>
+          <w:rFonts w:ascii="Times New Roman" w:hAnsi="Times New Roman"/>
+          <w:sz w:val="24"/>
+        </w:rPr>
       </w:r>
     </w:p>
     <w:p>
@@ -1813,14 +1813,14 @@
           <w:sz w:val="24"/>
         </w:rPr>
         <w:t>3.2.7  The Model and its Training</w:t>
-      </w:r>
-      <w:r>
-        <w:rPr>
-          <w:rFonts w:ascii="Times New Roman" w:hAnsi="Times New Roman"/>
-          <w:sz w:val="24"/>
-        </w:rPr>
         <w:tab/>
-        <w:t>15</w:t>
+        <w:t>16</w:t>
+      </w:r>
+      <w:r>
+        <w:rPr>
+          <w:rFonts w:ascii="Times New Roman" w:hAnsi="Times New Roman"/>
+          <w:sz w:val="24"/>
+        </w:rPr>
       </w:r>
     </w:p>
     <w:p>
@@ -1838,14 +1838,14 @@
           <w:sz w:val="24"/>
         </w:rPr>
         <w:t>3.2.8  The Application Programming Interface</w:t>
-      </w:r>
-      <w:r>
-        <w:rPr>
-          <w:rFonts w:ascii="Times New Roman" w:hAnsi="Times New Roman"/>
-          <w:sz w:val="24"/>
-        </w:rPr>
         <w:tab/>
-        <w:t>16</w:t>
+        <w:t>17</w:t>
+      </w:r>
+      <w:r>
+        <w:rPr>
+          <w:rFonts w:ascii="Times New Roman" w:hAnsi="Times New Roman"/>
+          <w:sz w:val="24"/>
+        </w:rPr>
       </w:r>
     </w:p>
     <w:p>
@@ -1863,14 +1863,14 @@
           <w:sz w:val="24"/>
         </w:rPr>
         <w:t>3.2.9  Handling of Devanagari Text</w:t>
-      </w:r>
-      <w:r>
-        <w:rPr>
-          <w:rFonts w:ascii="Times New Roman" w:hAnsi="Times New Roman"/>
-          <w:sz w:val="24"/>
-        </w:rPr>
         <w:tab/>
-        <w:t>16</w:t>
+        <w:t>17</w:t>
+      </w:r>
+      <w:r>
+        <w:rPr>
+          <w:rFonts w:ascii="Times New Roman" w:hAnsi="Times New Roman"/>
+          <w:sz w:val="24"/>
+        </w:rPr>
       </w:r>
     </w:p>
     <w:p>
@@ -1889,7 +1889,7 @@
         </w:rPr>
         <w:t>3.2.10  Division of Work</w:t>
         <w:tab/>
-        <w:t>17</w:t>
+        <w:t>18</w:t>
       </w:r>
     </w:p>
     <w:p>
@@ -1908,7 +1908,7 @@
         </w:rPr>
         <w:t>Chapter 4 TESTING</w:t>
         <w:tab/>
-        <w:t>19</w:t>
+        <w:t>20</w:t>
       </w:r>
       <w:r>
         <w:rPr>
@@ -1933,7 +1933,7 @@
         </w:rPr>
         <w:t>4.1  Test Objectives</w:t>
         <w:tab/>
-        <w:t>19</w:t>
+        <w:t>20</w:t>
       </w:r>
       <w:r>
         <w:rPr>
@@ -1958,7 +1958,7 @@
         </w:rPr>
         <w:t>4.2  Unit Testing</w:t>
         <w:tab/>
-        <w:t>19</w:t>
+        <w:t>20</w:t>
       </w:r>
       <w:r>
         <w:rPr>
@@ -1983,7 +1983,7 @@
         </w:rPr>
         <w:t>4.3  Functional Test Cases</w:t>
         <w:tab/>
-        <w:t>20</w:t>
+        <w:t>21</w:t>
       </w:r>
       <w:r>
         <w:rPr>
@@ -2008,7 +2008,7 @@
         </w:rPr>
         <w:t>4.4  Acceptance Testing</w:t>
         <w:tab/>
-        <w:t>21</w:t>
+        <w:t>22</w:t>
       </w:r>
       <w:r>
         <w:rPr>
@@ -2033,7 +2033,7 @@
         </w:rPr>
         <w:t>Chapter 5 RESULT AND DISCUSSION</w:t>
         <w:tab/>
-        <w:t>22</w:t>
+        <w:t>23</w:t>
       </w:r>
       <w:r>
         <w:rPr>
@@ -2058,7 +2058,7 @@
         </w:rPr>
         <w:t>5.1  Output of the System</w:t>
         <w:tab/>
-        <w:t>22</w:t>
+        <w:t>23</w:t>
       </w:r>
       <w:r>
         <w:rPr>
@@ -2083,7 +2083,7 @@
         </w:rPr>
         <w:t>5.2  Accuracy of the Two Engines</w:t>
         <w:tab/>
-        <w:t>22</w:t>
+        <w:t>23</w:t>
       </w:r>
       <w:r>
         <w:rPr>
@@ -2108,7 +2108,7 @@
         </w:rPr>
         <w:t>5.3  Confusion Matrix</w:t>
         <w:tab/>
-        <w:t>24</w:t>
+        <w:t>25</w:t>
       </w:r>
       <w:r>
         <w:rPr>
@@ -2133,7 +2133,7 @@
         </w:rPr>
         <w:t>5.4  The Threshold</w:t>
         <w:tab/>
-        <w:t>24</w:t>
+        <w:t>25</w:t>
       </w:r>
       <w:r>
         <w:rPr>
@@ -2158,7 +2158,7 @@
         </w:rPr>
         <w:t>5.5  Speed of the Comparison</w:t>
         <w:tab/>
-        <w:t>25</w:t>
+        <w:t>26</w:t>
       </w:r>
       <w:r>
         <w:rPr>
@@ -2183,7 +2183,7 @@
         </w:rPr>
         <w:t>5.6  Impact and Significance</w:t>
         <w:tab/>
-        <w:t>26</w:t>
+        <w:t>27</w:t>
       </w:r>
       <w:r>
         <w:rPr>
@@ -2208,7 +2208,7 @@
         </w:rPr>
         <w:t>5.7  Limitations</w:t>
         <w:tab/>
-        <w:t>26</w:t>
+        <w:t>27</w:t>
       </w:r>
       <w:r>
         <w:rPr>
@@ -2233,7 +2233,7 @@
         </w:rPr>
         <w:t>Chapter 6 CONCLUSION AND FUTURE WORKS</w:t>
         <w:tab/>
-        <w:t>27</w:t>
+        <w:t>28</w:t>
       </w:r>
       <w:r>
         <w:rPr>
@@ -2258,7 +2258,7 @@
         </w:rPr>
         <w:t>BIBLIOGRAPHY</w:t>
         <w:tab/>
-        <w:t>29</w:t>
+        <w:t>30</w:t>
       </w:r>
       <w:r>
         <w:rPr>
@@ -2283,7 +2283,7 @@
         </w:rPr>
         <w:t>ANNEXES</w:t>
         <w:tab/>
-        <w:t>31</w:t>
+        <w:t>32</w:t>
       </w:r>
       <w:r>
         <w:rPr>
@@ -2328,14 +2328,14 @@
           <w:sz w:val="24"/>
         </w:rPr>
         <w:t>Figure 1: System architecture of the Plagiarism Detector</w:t>
-      </w:r>
-      <w:r>
-        <w:rPr>
-          <w:rFonts w:ascii="Times New Roman" w:hAnsi="Times New Roman"/>
-          <w:sz w:val="24"/>
-        </w:rPr>
         <w:tab/>
-        <w:t>10</w:t>
+        <w:t>11</w:t>
+      </w:r>
+      <w:r>
+        <w:rPr>
+          <w:rFonts w:ascii="Times New Roman" w:hAnsi="Times New Roman"/>
+          <w:sz w:val="24"/>
+        </w:rPr>
       </w:r>
     </w:p>
     <w:p>
@@ -2353,14 +2353,14 @@
           <w:sz w:val="24"/>
         </w:rPr>
         <w:t>Figure 2: Use case diagram of the system</w:t>
-      </w:r>
-      <w:r>
-        <w:rPr>
-          <w:rFonts w:ascii="Times New Roman" w:hAnsi="Times New Roman"/>
-          <w:sz w:val="24"/>
-        </w:rPr>
         <w:tab/>
-        <w:t>12</w:t>
+        <w:t>13</w:t>
+      </w:r>
+      <w:r>
+        <w:rPr>
+          <w:rFonts w:ascii="Times New Roman" w:hAnsi="Times New Roman"/>
+          <w:sz w:val="24"/>
+        </w:rPr>
       </w:r>
     </w:p>
     <w:p>
@@ -2378,14 +2378,14 @@
           <w:sz w:val="24"/>
         </w:rPr>
         <w:t>Figure 3: Level 0 data flow diagram (context diagram)</w:t>
-      </w:r>
-      <w:r>
-        <w:rPr>
-          <w:rFonts w:ascii="Times New Roman" w:hAnsi="Times New Roman"/>
-          <w:sz w:val="24"/>
-        </w:rPr>
         <w:tab/>
-        <w:t>14</w:t>
+        <w:t>15</w:t>
+      </w:r>
+      <w:r>
+        <w:rPr>
+          <w:rFonts w:ascii="Times New Roman" w:hAnsi="Times New Roman"/>
+          <w:sz w:val="24"/>
+        </w:rPr>
       </w:r>
     </w:p>
     <w:p>
@@ -2403,14 +2403,14 @@
           <w:sz w:val="24"/>
         </w:rPr>
         <w:t>Figure 4: Level 1 data flow diagram</w:t>
-      </w:r>
-      <w:r>
-        <w:rPr>
-          <w:rFonts w:ascii="Times New Roman" w:hAnsi="Times New Roman"/>
-          <w:sz w:val="24"/>
-        </w:rPr>
         <w:tab/>
-        <w:t>14</w:t>
+        <w:t>15</w:t>
+      </w:r>
+      <w:r>
+        <w:rPr>
+          <w:rFonts w:ascii="Times New Roman" w:hAnsi="Times New Roman"/>
+          <w:sz w:val="24"/>
+        </w:rPr>
       </w:r>
     </w:p>
     <w:p>
@@ -2428,14 +2428,14 @@
           <w:sz w:val="24"/>
         </w:rPr>
         <w:t>Figure 5: Sequence diagram of a batch comparison</w:t>
-      </w:r>
-      <w:r>
-        <w:rPr>
-          <w:rFonts w:ascii="Times New Roman" w:hAnsi="Times New Roman"/>
-          <w:sz w:val="24"/>
-        </w:rPr>
         <w:tab/>
-        <w:t>15</w:t>
+        <w:t>16</w:t>
+      </w:r>
+      <w:r>
+        <w:rPr>
+          <w:rFonts w:ascii="Times New Roman" w:hAnsi="Times New Roman"/>
+          <w:sz w:val="24"/>
+        </w:rPr>
       </w:r>
     </w:p>
     <w:p>
@@ -2453,14 +2453,14 @@
           <w:sz w:val="24"/>
         </w:rPr>
         <w:t>Figure 6: Timeline chart of the ten sprints</w:t>
-      </w:r>
-      <w:r>
-        <w:rPr>
-          <w:rFonts w:ascii="Times New Roman" w:hAnsi="Times New Roman"/>
-          <w:sz w:val="24"/>
-        </w:rPr>
         <w:tab/>
-        <w:t>15</w:t>
+        <w:t>16</w:t>
+      </w:r>
+      <w:r>
+        <w:rPr>
+          <w:rFonts w:ascii="Times New Roman" w:hAnsi="Times New Roman"/>
+          <w:sz w:val="24"/>
+        </w:rPr>
       </w:r>
     </w:p>
     <w:p>
@@ -2479,7 +2479,7 @@
         </w:rPr>
         <w:t>Figure 7: Accuracy of the three engines on both evaluation sets</w:t>
         <w:tab/>
-        <w:t>23</w:t>
+        <w:t>24</w:t>
       </w:r>
       <w:r>
         <w:rPr>
@@ -2504,7 +2504,7 @@
         </w:rPr>
         <w:t>Figure 8: Comparison time before and after the optimisation</w:t>
         <w:tab/>
-        <w:t>25</w:t>
+        <w:t>26</w:t>
       </w:r>
       <w:r>
         <w:rPr>
@@ -2549,14 +2549,14 @@
           <w:sz w:val="24"/>
         </w:rPr>
         <w:t>Table 1: Review of the existing plagiarism checking tools</w:t>
-      </w:r>
-      <w:r>
-        <w:rPr>
-          <w:rFonts w:ascii="Times New Roman" w:hAnsi="Times New Roman"/>
-          <w:sz w:val="24"/>
-        </w:rPr>
         <w:tab/>
-        <w:t>6</w:t>
+        <w:t>7</w:t>
+      </w:r>
+      <w:r>
+        <w:rPr>
+          <w:rFonts w:ascii="Times New Roman" w:hAnsi="Times New Roman"/>
+          <w:sz w:val="24"/>
+        </w:rPr>
       </w:r>
     </w:p>
     <w:p>
@@ -2574,14 +2574,14 @@
           <w:sz w:val="24"/>
         </w:rPr>
         <w:t>Table 2: Required tools</w:t>
-      </w:r>
-      <w:r>
-        <w:rPr>
-          <w:rFonts w:ascii="Times New Roman" w:hAnsi="Times New Roman"/>
-          <w:sz w:val="24"/>
-        </w:rPr>
         <w:tab/>
-        <w:t>7</w:t>
+        <w:t>8</w:t>
+      </w:r>
+      <w:r>
+        <w:rPr>
+          <w:rFonts w:ascii="Times New Roman" w:hAnsi="Times New Roman"/>
+          <w:sz w:val="24"/>
+        </w:rPr>
       </w:r>
     </w:p>
     <w:p>
@@ -2599,14 +2599,14 @@
           <w:sz w:val="24"/>
         </w:rPr>
         <w:t>Table 3: Technologies used in the system</w:t>
-      </w:r>
-      <w:r>
-        <w:rPr>
-          <w:rFonts w:ascii="Times New Roman" w:hAnsi="Times New Roman"/>
-          <w:sz w:val="24"/>
-        </w:rPr>
         <w:tab/>
-        <w:t>9</w:t>
+        <w:t>10</w:t>
+      </w:r>
+      <w:r>
+        <w:rPr>
+          <w:rFonts w:ascii="Times New Roman" w:hAnsi="Times New Roman"/>
+          <w:sz w:val="24"/>
+        </w:rPr>
       </w:r>
     </w:p>
     <w:p>
@@ -2624,14 +2624,14 @@
           <w:sz w:val="24"/>
         </w:rPr>
         <w:t>Table 4: Sprint deliverables of the ten sprints</w:t>
-      </w:r>
-      <w:r>
-        <w:rPr>
-          <w:rFonts w:ascii="Times New Roman" w:hAnsi="Times New Roman"/>
-          <w:sz w:val="24"/>
-        </w:rPr>
         <w:tab/>
-        <w:t>10</w:t>
+        <w:t>11</w:t>
+      </w:r>
+      <w:r>
+        <w:rPr>
+          <w:rFonts w:ascii="Times New Roman" w:hAnsi="Times New Roman"/>
+          <w:sz w:val="24"/>
+        </w:rPr>
       </w:r>
     </w:p>
     <w:p>
@@ -2649,14 +2649,14 @@
           <w:sz w:val="24"/>
         </w:rPr>
         <w:t>Table 5: API endpoints of the system</w:t>
-      </w:r>
-      <w:r>
-        <w:rPr>
-          <w:rFonts w:ascii="Times New Roman" w:hAnsi="Times New Roman"/>
-          <w:sz w:val="24"/>
-        </w:rPr>
         <w:tab/>
-        <w:t>16</w:t>
+        <w:t>17</w:t>
+      </w:r>
+      <w:r>
+        <w:rPr>
+          <w:rFonts w:ascii="Times New Roman" w:hAnsi="Times New Roman"/>
+          <w:sz w:val="24"/>
+        </w:rPr>
       </w:r>
     </w:p>
     <w:p>
@@ -2675,7 +2675,7 @@
         </w:rPr>
         <w:t>Table 6: Unit tests written for the services</w:t>
         <w:tab/>
-        <w:t>19</w:t>
+        <w:t>20</w:t>
       </w:r>
       <w:r>
         <w:rPr>
@@ -2700,7 +2700,7 @@
         </w:rPr>
         <w:t>Table 7: Functional test cases</w:t>
         <w:tab/>
-        <w:t>20</w:t>
+        <w:t>21</w:t>
       </w:r>
       <w:r>
         <w:rPr>
@@ -2725,7 +2725,7 @@
         </w:rPr>
         <w:t>Table 8: Similarity scores produced for the sample documents</w:t>
         <w:tab/>
-        <w:t>22</w:t>
+        <w:t>23</w:t>
       </w:r>
       <w:r>
         <w:rPr>
@@ -2750,7 +2750,7 @@
         </w:rPr>
         <w:t>Table 9: Accuracy of the engines on the two evaluation sets</w:t>
         <w:tab/>
-        <w:t>23</w:t>
+        <w:t>24</w:t>
       </w:r>
       <w:r>
         <w:rPr>
@@ -2775,7 +2775,7 @@
         </w:rPr>
         <w:t>Table 10: Confusion matrix of the three engines on the in-domain set</w:t>
         <w:tab/>
-        <w:t>24</w:t>
+        <w:t>25</w:t>
       </w:r>
       <w:r>
         <w:rPr>
@@ -2800,7 +2800,7 @@
         </w:rPr>
         <w:t>Table 11: Comparison time before and after the optimisation</w:t>
         <w:tab/>
-        <w:t>25</w:t>
+        <w:t>26</w:t>
       </w:r>
       <w:r>
         <w:rPr>
@@ -2999,7 +2999,7 @@
           <w:rFonts w:ascii="Times New Roman" w:hAnsi="Times New Roman"/>
           <w:sz w:val="24"/>
         </w:rPr>
-        <w:t>To build a system that takes a batch of submitted documents, compares every one against every other, and reports for each pair how close they are and which sentences are the copied ones.</w:t>
+        <w:t>To compare a batch of uploaded documents against each other and produce an n by n cosine similarity matrix, and for every pair that crosses the threshold to report both the percentage of the document that appears copied and the individual sentences that match, with the decision threshold exposed as a control in the interface and adjustable between 0.10 and 0.99 rather than fixed in the code, its default being 0.70.</w:t>
       </w:r>
     </w:p>
     <w:p>
@@ -3013,7 +3013,7 @@
           <w:rFonts w:ascii="Times New Roman" w:hAnsi="Times New Roman"/>
           <w:sz w:val="24"/>
         </w:rPr>
-        <w:t>To check a document against public web pages as well, since a great deal of what gets copied never passes through another student at all.</w:t>
+        <w:t>To check any single document against public web pages, building the search query from the six most frequent content words of the document, retrieving up to ten results through the DuckDuckGo HTML endpoint so that neither an API key nor an account is required, stripping each page down to its paragraph text, and listing only those pages that share at least one sentence above the threshold, while a page that is unreachable or slow is skipped so that a single dead link never fails the request.</w:t>
       </w:r>
     </w:p>
     <w:p>
@@ -3027,7 +3027,7 @@
           <w:rFonts w:ascii="Times New Roman" w:hAnsi="Times New Roman"/>
           <w:sz w:val="24"/>
         </w:rPr>
-        <w:t>To catch paraphrased text by fine tuning a Sentence-BERT model on labelled paraphrase pairs, and to measure it against a TF-IDF baseline we write ourselves, so that the improvement is shown rather than claimed.</w:t>
+        <w:t>To catch paraphrased text by fine tuning the all-MiniLM-L6-v2 Sentence-BERT model on 27,000 labelled pairs from the Quora Question Pairs corpus in a Siamese arrangement with a cosine similarity loss, and to measure it against a TF-IDF baseline written from scratch with PyTorch tensors, both engines being scored on the same 2,000 held out pairs through the same cosine so that any difference belongs to the model and not to an imported library, the criterion being a measurable gain in accuracy and in the separation between the paraphrased and the unrelated score distributions.</w:t>
       </w:r>
     </w:p>
     <w:p>
@@ -3041,7 +3041,7 @@
           <w:rFonts w:ascii="Times New Roman" w:hAnsi="Times New Roman"/>
           <w:sz w:val="24"/>
         </w:rPr>
-        <w:t>To accept PDF, DOCX, TXT and scanned images, running the scans through optical character recognition, and to handle Devanagari alongside English.</w:t>
+        <w:t>To accept the formats that students actually submit, that is PDF, DOCX, TXT and MD together with PNG, JPG, JPEG, BMP and TIFF images, routing every image and every PDF that carries no text layer through Tesseract optical character recognition automatically, and to handle Devanagari alongside English by ending a sentence on the danda, keeping Devanagari words in the tokenizer and loading the Nepali training data whenever the machine has it installed.</w:t>
       </w:r>
     </w:p>
     <w:p>
@@ -3055,7 +3055,7 @@
           <w:rFonts w:ascii="Times New Roman" w:hAnsi="Times New Roman"/>
           <w:sz w:val="24"/>
         </w:rPr>
-        <w:t>To keep the whole thing free and open to anyone, with no login and no copy of any uploaded file kept once the answer has been sent.</w:t>
+        <w:t>To keep the system free and open to anyone, with no account, no login and no payment, and to write no uploaded file to disk or to a database at any point, every file being processed in memory and discarded once the response has been sent.</w:t>
       </w:r>
     </w:p>
     <w:p>

</xml_diff>

<commit_message>
Reduce the objectives to three short points
</commit_message>
<xml_diff>
--- a/report/Project_II_Report_Plagiarism_Detector.docx
+++ b/report/Project_II_Report_Plagiarism_Detector.docx
@@ -1464,7 +1464,7 @@
         </w:rPr>
         <w:t>1.4  How Our System Works</w:t>
         <w:tab/>
-        <w:t>3</w:t>
+        <w:t>2</w:t>
       </w:r>
       <w:r>
         <w:rPr>
@@ -1489,7 +1489,7 @@
         </w:rPr>
         <w:t>Chapter 2 LITERATURE REVIEW</w:t>
         <w:tab/>
-        <w:t>5</w:t>
+        <w:t>4</w:t>
       </w:r>
       <w:r>
         <w:rPr>
@@ -1514,7 +1514,7 @@
         </w:rPr>
         <w:t>2.1  Theoretical Foundations</w:t>
         <w:tab/>
-        <w:t>5</w:t>
+        <w:t>4</w:t>
       </w:r>
       <w:r>
         <w:rPr>
@@ -1539,7 +1539,7 @@
         </w:rPr>
         <w:t>2.2  Gap in Literature</w:t>
         <w:tab/>
-        <w:t>6</w:t>
+        <w:t>5</w:t>
       </w:r>
       <w:r>
         <w:rPr>
@@ -1564,7 +1564,7 @@
         </w:rPr>
         <w:t>2.3  Review of Related Works</w:t>
         <w:tab/>
-        <w:t>7</w:t>
+        <w:t>6</w:t>
       </w:r>
       <w:r>
         <w:rPr>
@@ -1589,7 +1589,7 @@
         </w:rPr>
         <w:t>Chapter 3 TOOLS AND METHODOLOGY</w:t>
         <w:tab/>
-        <w:t>8</w:t>
+        <w:t>7</w:t>
       </w:r>
       <w:r>
         <w:rPr>
@@ -1614,7 +1614,7 @@
         </w:rPr>
         <w:t>3.1  Required Tools</w:t>
         <w:tab/>
-        <w:t>8</w:t>
+        <w:t>7</w:t>
       </w:r>
       <w:r>
         <w:rPr>
@@ -1639,7 +1639,7 @@
         </w:rPr>
         <w:t>3.2  Methodology</w:t>
         <w:tab/>
-        <w:t>8</w:t>
+        <w:t>7</w:t>
       </w:r>
       <w:r>
         <w:rPr>
@@ -1664,7 +1664,7 @@
         </w:rPr>
         <w:t>3.2.1  System Development Approach</w:t>
         <w:tab/>
-        <w:t>8</w:t>
+        <w:t>7</w:t>
       </w:r>
       <w:r>
         <w:rPr>
@@ -1689,7 +1689,7 @@
         </w:rPr>
         <w:t>3.2.2  Implementation Process</w:t>
         <w:tab/>
-        <w:t>9</w:t>
+        <w:t>8</w:t>
       </w:r>
       <w:r>
         <w:rPr>
@@ -1714,7 +1714,7 @@
         </w:rPr>
         <w:t>3.2.3  Technologies Used</w:t>
         <w:tab/>
-        <w:t>10</w:t>
+        <w:t>9</w:t>
       </w:r>
       <w:r>
         <w:rPr>
@@ -1739,7 +1739,7 @@
         </w:rPr>
         <w:t>3.2.4  System Architecture</w:t>
         <w:tab/>
-        <w:t>10</w:t>
+        <w:t>9</w:t>
       </w:r>
       <w:r>
         <w:rPr>
@@ -1764,7 +1764,7 @@
         </w:rPr>
         <w:t>3.2.5  Agile Implementation</w:t>
         <w:tab/>
-        <w:t>11</w:t>
+        <w:t>10</w:t>
       </w:r>
       <w:r>
         <w:rPr>
@@ -1789,7 +1789,7 @@
         </w:rPr>
         <w:t>3.2.6  Designs</w:t>
         <w:tab/>
-        <w:t>13</w:t>
+        <w:t>12</w:t>
       </w:r>
       <w:r>
         <w:rPr>
@@ -1814,7 +1814,7 @@
         </w:rPr>
         <w:t>3.2.7  The Model and its Training</w:t>
         <w:tab/>
-        <w:t>16</w:t>
+        <w:t>15</w:t>
       </w:r>
       <w:r>
         <w:rPr>
@@ -1839,7 +1839,7 @@
         </w:rPr>
         <w:t>3.2.8  The Application Programming Interface</w:t>
         <w:tab/>
-        <w:t>17</w:t>
+        <w:t>16</w:t>
       </w:r>
       <w:r>
         <w:rPr>
@@ -1864,7 +1864,7 @@
         </w:rPr>
         <w:t>3.2.9  Handling of Devanagari Text</w:t>
         <w:tab/>
-        <w:t>17</w:t>
+        <w:t>16</w:t>
       </w:r>
       <w:r>
         <w:rPr>
@@ -1889,7 +1889,7 @@
         </w:rPr>
         <w:t>3.2.10  Division of Work</w:t>
         <w:tab/>
-        <w:t>18</w:t>
+        <w:t>17</w:t>
       </w:r>
     </w:p>
     <w:p>
@@ -1908,7 +1908,7 @@
         </w:rPr>
         <w:t>Chapter 4 TESTING</w:t>
         <w:tab/>
-        <w:t>20</w:t>
+        <w:t>19</w:t>
       </w:r>
       <w:r>
         <w:rPr>
@@ -1933,7 +1933,7 @@
         </w:rPr>
         <w:t>4.1  Test Objectives</w:t>
         <w:tab/>
-        <w:t>20</w:t>
+        <w:t>19</w:t>
       </w:r>
       <w:r>
         <w:rPr>
@@ -1958,7 +1958,7 @@
         </w:rPr>
         <w:t>4.2  Unit Testing</w:t>
         <w:tab/>
-        <w:t>20</w:t>
+        <w:t>19</w:t>
       </w:r>
       <w:r>
         <w:rPr>
@@ -1983,7 +1983,7 @@
         </w:rPr>
         <w:t>4.3  Functional Test Cases</w:t>
         <w:tab/>
-        <w:t>21</w:t>
+        <w:t>20</w:t>
       </w:r>
       <w:r>
         <w:rPr>
@@ -2008,7 +2008,7 @@
         </w:rPr>
         <w:t>4.4  Acceptance Testing</w:t>
         <w:tab/>
-        <w:t>22</w:t>
+        <w:t>21</w:t>
       </w:r>
       <w:r>
         <w:rPr>
@@ -2033,7 +2033,7 @@
         </w:rPr>
         <w:t>Chapter 5 RESULT AND DISCUSSION</w:t>
         <w:tab/>
-        <w:t>23</w:t>
+        <w:t>22</w:t>
       </w:r>
       <w:r>
         <w:rPr>
@@ -2058,7 +2058,7 @@
         </w:rPr>
         <w:t>5.1  Output of the System</w:t>
         <w:tab/>
-        <w:t>23</w:t>
+        <w:t>22</w:t>
       </w:r>
       <w:r>
         <w:rPr>
@@ -2083,7 +2083,7 @@
         </w:rPr>
         <w:t>5.2  Accuracy of the Two Engines</w:t>
         <w:tab/>
-        <w:t>23</w:t>
+        <w:t>22</w:t>
       </w:r>
       <w:r>
         <w:rPr>
@@ -2108,7 +2108,7 @@
         </w:rPr>
         <w:t>5.3  Confusion Matrix</w:t>
         <w:tab/>
-        <w:t>25</w:t>
+        <w:t>24</w:t>
       </w:r>
       <w:r>
         <w:rPr>
@@ -2133,7 +2133,7 @@
         </w:rPr>
         <w:t>5.4  The Threshold</w:t>
         <w:tab/>
-        <w:t>25</w:t>
+        <w:t>24</w:t>
       </w:r>
       <w:r>
         <w:rPr>
@@ -2158,7 +2158,7 @@
         </w:rPr>
         <w:t>5.5  Speed of the Comparison</w:t>
         <w:tab/>
-        <w:t>26</w:t>
+        <w:t>25</w:t>
       </w:r>
       <w:r>
         <w:rPr>
@@ -2183,7 +2183,7 @@
         </w:rPr>
         <w:t>5.6  Impact and Significance</w:t>
         <w:tab/>
-        <w:t>27</w:t>
+        <w:t>26</w:t>
       </w:r>
       <w:r>
         <w:rPr>
@@ -2208,7 +2208,7 @@
         </w:rPr>
         <w:t>5.7  Limitations</w:t>
         <w:tab/>
-        <w:t>27</w:t>
+        <w:t>26</w:t>
       </w:r>
       <w:r>
         <w:rPr>
@@ -2233,7 +2233,7 @@
         </w:rPr>
         <w:t>Chapter 6 CONCLUSION AND FUTURE WORKS</w:t>
         <w:tab/>
-        <w:t>28</w:t>
+        <w:t>27</w:t>
       </w:r>
       <w:r>
         <w:rPr>
@@ -2258,7 +2258,7 @@
         </w:rPr>
         <w:t>BIBLIOGRAPHY</w:t>
         <w:tab/>
-        <w:t>30</w:t>
+        <w:t>29</w:t>
       </w:r>
       <w:r>
         <w:rPr>
@@ -2283,7 +2283,7 @@
         </w:rPr>
         <w:t>ANNEXES</w:t>
         <w:tab/>
-        <w:t>32</w:t>
+        <w:t>31</w:t>
       </w:r>
       <w:r>
         <w:rPr>
@@ -2329,7 +2329,7 @@
         </w:rPr>
         <w:t>Figure 1: System architecture of the Plagiarism Detector</w:t>
         <w:tab/>
-        <w:t>11</w:t>
+        <w:t>10</w:t>
       </w:r>
       <w:r>
         <w:rPr>
@@ -2354,7 +2354,7 @@
         </w:rPr>
         <w:t>Figure 2: Use case diagram of the system</w:t>
         <w:tab/>
-        <w:t>13</w:t>
+        <w:t>12</w:t>
       </w:r>
       <w:r>
         <w:rPr>
@@ -2379,7 +2379,7 @@
         </w:rPr>
         <w:t>Figure 3: Level 0 data flow diagram (context diagram)</w:t>
         <w:tab/>
-        <w:t>15</w:t>
+        <w:t>14</w:t>
       </w:r>
       <w:r>
         <w:rPr>
@@ -2404,7 +2404,7 @@
         </w:rPr>
         <w:t>Figure 4: Level 1 data flow diagram</w:t>
         <w:tab/>
-        <w:t>15</w:t>
+        <w:t>14</w:t>
       </w:r>
       <w:r>
         <w:rPr>
@@ -2429,7 +2429,7 @@
         </w:rPr>
         <w:t>Figure 5: Sequence diagram of a batch comparison</w:t>
         <w:tab/>
-        <w:t>16</w:t>
+        <w:t>15</w:t>
       </w:r>
       <w:r>
         <w:rPr>
@@ -2454,7 +2454,7 @@
         </w:rPr>
         <w:t>Figure 6: Timeline chart of the ten sprints</w:t>
         <w:tab/>
-        <w:t>16</w:t>
+        <w:t>15</w:t>
       </w:r>
       <w:r>
         <w:rPr>
@@ -2479,7 +2479,7 @@
         </w:rPr>
         <w:t>Figure 7: Accuracy of the three engines on both evaluation sets</w:t>
         <w:tab/>
-        <w:t>24</w:t>
+        <w:t>23</w:t>
       </w:r>
       <w:r>
         <w:rPr>
@@ -2504,7 +2504,7 @@
         </w:rPr>
         <w:t>Figure 8: Comparison time before and after the optimisation</w:t>
         <w:tab/>
-        <w:t>26</w:t>
+        <w:t>25</w:t>
       </w:r>
       <w:r>
         <w:rPr>
@@ -2550,7 +2550,7 @@
         </w:rPr>
         <w:t>Table 1: Review of the existing plagiarism checking tools</w:t>
         <w:tab/>
-        <w:t>7</w:t>
+        <w:t>6</w:t>
       </w:r>
       <w:r>
         <w:rPr>
@@ -2575,7 +2575,7 @@
         </w:rPr>
         <w:t>Table 2: Required tools</w:t>
         <w:tab/>
-        <w:t>8</w:t>
+        <w:t>7</w:t>
       </w:r>
       <w:r>
         <w:rPr>
@@ -2600,7 +2600,7 @@
         </w:rPr>
         <w:t>Table 3: Technologies used in the system</w:t>
         <w:tab/>
-        <w:t>10</w:t>
+        <w:t>9</w:t>
       </w:r>
       <w:r>
         <w:rPr>
@@ -2625,7 +2625,7 @@
         </w:rPr>
         <w:t>Table 4: Sprint deliverables of the ten sprints</w:t>
         <w:tab/>
-        <w:t>11</w:t>
+        <w:t>10</w:t>
       </w:r>
       <w:r>
         <w:rPr>
@@ -2650,7 +2650,7 @@
         </w:rPr>
         <w:t>Table 5: API endpoints of the system</w:t>
         <w:tab/>
-        <w:t>17</w:t>
+        <w:t>16</w:t>
       </w:r>
       <w:r>
         <w:rPr>
@@ -2675,7 +2675,7 @@
         </w:rPr>
         <w:t>Table 6: Unit tests written for the services</w:t>
         <w:tab/>
-        <w:t>20</w:t>
+        <w:t>19</w:t>
       </w:r>
       <w:r>
         <w:rPr>
@@ -2700,7 +2700,7 @@
         </w:rPr>
         <w:t>Table 7: Functional test cases</w:t>
         <w:tab/>
-        <w:t>21</w:t>
+        <w:t>20</w:t>
       </w:r>
       <w:r>
         <w:rPr>
@@ -2725,7 +2725,7 @@
         </w:rPr>
         <w:t>Table 8: Similarity scores produced for the sample documents</w:t>
         <w:tab/>
-        <w:t>23</w:t>
+        <w:t>22</w:t>
       </w:r>
       <w:r>
         <w:rPr>
@@ -2750,7 +2750,7 @@
         </w:rPr>
         <w:t>Table 9: Accuracy of the engines on the two evaluation sets</w:t>
         <w:tab/>
-        <w:t>24</w:t>
+        <w:t>23</w:t>
       </w:r>
       <w:r>
         <w:rPr>
@@ -2775,7 +2775,7 @@
         </w:rPr>
         <w:t>Table 10: Confusion matrix of the three engines on the in-domain set</w:t>
         <w:tab/>
-        <w:t>25</w:t>
+        <w:t>24</w:t>
       </w:r>
       <w:r>
         <w:rPr>
@@ -2800,7 +2800,7 @@
         </w:rPr>
         <w:t>Table 11: Comparison time before and after the optimisation</w:t>
         <w:tab/>
-        <w:t>26</w:t>
+        <w:t>25</w:t>
       </w:r>
       <w:r>
         <w:rPr>
@@ -2999,7 +2999,7 @@
           <w:rFonts w:ascii="Times New Roman" w:hAnsi="Times New Roman"/>
           <w:sz w:val="24"/>
         </w:rPr>
-        <w:t>To compare a batch of uploaded documents against each other and produce an n by n cosine similarity matrix, and for every pair that crosses the threshold to report both the percentage of the document that appears copied and the individual sentences that match, with the decision threshold exposed as a control in the interface and adjustable between 0.10 and 0.99 rather than fixed in the code, its default being 0.70.</w:t>
+        <w:t>To compare a batch of uploaded documents against each other and against public web pages.</w:t>
       </w:r>
     </w:p>
     <w:p>
@@ -3013,7 +3013,7 @@
           <w:rFonts w:ascii="Times New Roman" w:hAnsi="Times New Roman"/>
           <w:sz w:val="24"/>
         </w:rPr>
-        <w:t>To check any single document against public web pages, building the search query from the six most frequent content words of the document, retrieving up to ten results through the DuckDuckGo HTML endpoint so that neither an API key nor an account is required, stripping each page down to its paragraph text, and listing only those pages that share at least one sentence above the threshold, while a page that is unreachable or slow is skipped so that a single dead link never fails the request.</w:t>
+        <w:t>To catch paraphrased text with a fine tuned Sentence-BERT model, measured against a TF-IDF baseline.</w:t>
       </w:r>
     </w:p>
     <w:p>
@@ -3027,35 +3027,7 @@
           <w:rFonts w:ascii="Times New Roman" w:hAnsi="Times New Roman"/>
           <w:sz w:val="24"/>
         </w:rPr>
-        <w:t>To catch paraphrased text by fine tuning the all-MiniLM-L6-v2 Sentence-BERT model on 27,000 labelled pairs from the Quora Question Pairs corpus in a Siamese arrangement with a cosine similarity loss, and to measure it against a TF-IDF baseline written from scratch with PyTorch tensors, both engines being scored on the same 2,000 held out pairs through the same cosine so that any difference belongs to the model and not to an imported library, the criterion being a measurable gain in accuracy and in the separation between the paraphrased and the unrelated score distributions.</w:t>
-      </w:r>
-    </w:p>
-    <w:p>
-      <w:pPr>
-        <w:pStyle w:val="ListNumber"/>
-        <w:spacing w:line="360" w:lineRule="auto" w:after="40"/>
-        <w:ind w:left="576"/>
-      </w:pPr>
-      <w:r>
-        <w:rPr>
-          <w:rFonts w:ascii="Times New Roman" w:hAnsi="Times New Roman"/>
-          <w:sz w:val="24"/>
-        </w:rPr>
-        <w:t>To accept the formats that students actually submit, that is PDF, DOCX, TXT and MD together with PNG, JPG, JPEG, BMP and TIFF images, routing every image and every PDF that carries no text layer through Tesseract optical character recognition automatically, and to handle Devanagari alongside English by ending a sentence on the danda, keeping Devanagari words in the tokenizer and loading the Nepali training data whenever the machine has it installed.</w:t>
-      </w:r>
-    </w:p>
-    <w:p>
-      <w:pPr>
-        <w:pStyle w:val="ListNumber"/>
-        <w:spacing w:line="360" w:lineRule="auto" w:after="40"/>
-        <w:ind w:left="576"/>
-      </w:pPr>
-      <w:r>
-        <w:rPr>
-          <w:rFonts w:ascii="Times New Roman" w:hAnsi="Times New Roman"/>
-          <w:sz w:val="24"/>
-        </w:rPr>
-        <w:t>To keep the system free and open to anyone, with no account, no login and no payment, and to write no uploaded file to disk or to a database at any point, every file being processed in memory and discarded once the response has been sent.</w:t>
+        <w:t>To read PDF, DOCX and scanned images in English and Nepali, keeping no uploaded file.</w:t>
       </w:r>
     </w:p>
     <w:p>

</xml_diff>